<commit_message>
Added a bit of Documentation.
</commit_message>
<xml_diff>
--- a/Documentation/Project Outline.docx
+++ b/Documentation/Project Outline.docx
@@ -6610,6 +6610,99 @@
           <w14:ligatures w14:val="none"/>
         </w:rPr>
         <w:t xml:space="preserve"> R/A = Responsible &amp; Accountable</w:t>
+      </w:r>
+    </w:p>
+    <w:p/>
+    <w:p>
+      <w:pPr>
+        <w:pStyle w:val="Heading2"/>
+      </w:pPr>
+      <w:r>
+        <w:t>Project Phases</w:t>
+      </w:r>
+    </w:p>
+    <w:p>
+      <w:r>
+        <w:rPr>
+          <w:b/>
+          <w:bCs/>
+        </w:rPr>
+        <w:t>Phase 1</w:t>
+      </w:r>
+      <w:r>
+        <w:t xml:space="preserve"> — Project setup, folder structure, MongoDB Atlas connected</w:t>
+      </w:r>
+    </w:p>
+    <w:p>
+      <w:r>
+        <w:rPr>
+          <w:b/>
+          <w:bCs/>
+        </w:rPr>
+        <w:t>Phase 2</w:t>
+      </w:r>
+      <w:r>
+        <w:t xml:space="preserve"> — All 4 models created (User, Event, Booking, Enquiry)</w:t>
+      </w:r>
+    </w:p>
+    <w:p>
+      <w:r>
+        <w:rPr>
+          <w:b/>
+          <w:bCs/>
+        </w:rPr>
+        <w:t>Phase 3</w:t>
+      </w:r>
+      <w:r>
+        <w:t xml:space="preserve"> — Authentication (register, login, logout, middleware)</w:t>
+      </w:r>
+    </w:p>
+    <w:p>
+      <w:r>
+        <w:rPr>
+          <w:b/>
+          <w:bCs/>
+        </w:rPr>
+        <w:t>Phase 4</w:t>
+      </w:r>
+      <w:r>
+        <w:t xml:space="preserve"> — Routes &amp; Controllers (next up) Set up the remaining 4 route and controller pairs — events, admin, bookings and enquiries. This is where all your app’s logic lives.</w:t>
+      </w:r>
+    </w:p>
+    <w:p>
+      <w:r>
+        <w:rPr>
+          <w:b/>
+          <w:bCs/>
+        </w:rPr>
+        <w:t>Phase 5</w:t>
+      </w:r>
+      <w:r>
+        <w:t xml:space="preserve"> — EJS Views Build out all 5 mandatory pages properly with Bootstrap styling — home, auth, admin, dashboard and contact.</w:t>
+      </w:r>
+    </w:p>
+    <w:p>
+      <w:r>
+        <w:rPr>
+          <w:b/>
+          <w:bCs/>
+        </w:rPr>
+        <w:t>Phase 6</w:t>
+      </w:r>
+      <w:r>
+        <w:t xml:space="preserve"> — Booking Logic The capacity validation system — checks available tickets before confirming a booking and updates the count.</w:t>
+      </w:r>
+    </w:p>
+    <w:p>
+      <w:r>
+        <w:rPr>
+          <w:b/>
+          <w:bCs/>
+        </w:rPr>
+        <w:t>Phase 7</w:t>
+      </w:r>
+      <w:r>
+        <w:t xml:space="preserve"> — README &amp; Submission Write your README, clean up your code, zip the project and submit via Moodle.</w:t>
       </w:r>
     </w:p>
     <w:p/>

</xml_diff>